<commit_message>
added and test RAG tool
</commit_message>
<xml_diff>
--- a/tests/langraph_chat_tests.docx
+++ b/tests/langraph_chat_tests.docx
@@ -3,6 +3,19 @@
 <w:document xmlns:wpc="http://schemas.microsoft.com/office/word/2010/wordprocessingCanvas" xmlns:mc="http://schemas.openxmlformats.org/markup-compatibility/2006" xmlns:o="urn:schemas-microsoft-com:office:office" xmlns:r="http://schemas.openxmlformats.org/officeDocument/2006/relationships" xmlns:m="http://schemas.openxmlformats.org/officeDocument/2006/math" xmlns:v="urn:schemas-microsoft-com:vml" xmlns:wp14="http://schemas.microsoft.com/office/word/2010/wordprocessingDrawing" xmlns:wp="http://schemas.openxmlformats.org/drawingml/2006/wordprocessingDrawing" xmlns:w="http://schemas.openxmlformats.org/wordprocessingml/2006/main" xmlns:w14="http://schemas.microsoft.com/office/word/2010/wordml" xmlns:w10="urn:schemas-microsoft-com:office:word" xmlns:w15="http://schemas.microsoft.com/office/word/2012/wordml" xmlns:wpg="http://schemas.microsoft.com/office/word/2010/wordprocessingGroup" xmlns:wpi="http://schemas.microsoft.com/office/word/2010/wordprocessingInk" xmlns:wne="http://schemas.microsoft.com/office/word/2006/wordml" xmlns:wps="http://schemas.microsoft.com/office/word/2010/wordprocessingShape" xmlns:wpsCustomData="http://www.wps.cn/officeDocument/2013/wpsCustomData" mc:Ignorable="w14 w15 wp14">
   <w:body>
     <w:p>
+      <w:pPr>
+        <w:rPr>
+          <w:rFonts w:hint="default" w:ascii="Times New Roman" w:hAnsi="Times New Roman" w:eastAsia="SimSun" w:cs="Times New Roman"/>
+          <w:i w:val="0"/>
+          <w:iCs w:val="0"/>
+          <w:caps w:val="0"/>
+          <w:color w:val="000000"/>
+          <w:spacing w:val="0"/>
+          <w:sz w:val="24"/>
+          <w:szCs w:val="24"/>
+          <w:shd w:val="clear" w:fill="FFFFFF"/>
+        </w:rPr>
+      </w:pPr>
       <w:r>
         <w:rPr>
           <w:rFonts w:ascii="Segoe UI" w:hAnsi="Segoe UI" w:eastAsia="Segoe UI" w:cs="Segoe UI"/>
@@ -13,7 +26,6 @@
           <w:spacing w:val="0"/>
           <w:sz w:val="12"/>
           <w:szCs w:val="12"/>
-          <w:bdr w:val="none" w:color="auto" w:sz="0" w:space="0"/>
           <w:shd w:val="clear" w:fill="FFFFFF"/>
           <w:vertAlign w:val="baseline"/>
         </w:rPr>
@@ -69,7 +81,6 @@
           <w:spacing w:val="0"/>
           <w:sz w:val="12"/>
           <w:szCs w:val="12"/>
-          <w:bdr w:val="none" w:color="auto" w:sz="0" w:space="0"/>
           <w:shd w:val="clear" w:fill="FFFFFF"/>
           <w:vertAlign w:val="baseline"/>
         </w:rPr>
@@ -115,8 +126,6 @@
           </wp:inline>
         </w:drawing>
       </w:r>
-      <w:bookmarkStart w:id="0" w:name="_GoBack"/>
-      <w:bookmarkEnd w:id="0"/>
       <w:r>
         <w:rPr>
           <w:rFonts w:hint="default" w:ascii="Segoe UI" w:hAnsi="Segoe UI" w:eastAsia="Segoe UI" w:cs="Segoe UI"/>
@@ -127,7 +136,6 @@
           <w:spacing w:val="0"/>
           <w:sz w:val="12"/>
           <w:szCs w:val="12"/>
-          <w:bdr w:val="none" w:color="auto" w:sz="0" w:space="0"/>
           <w:shd w:val="clear" w:fill="FFFFFF"/>
           <w:vertAlign w:val="baseline"/>
         </w:rPr>
@@ -183,7 +191,6 @@
           <w:spacing w:val="0"/>
           <w:sz w:val="12"/>
           <w:szCs w:val="12"/>
-          <w:bdr w:val="none" w:color="auto" w:sz="0" w:space="0"/>
           <w:shd w:val="clear" w:fill="FFFFFF"/>
           <w:vertAlign w:val="baseline"/>
         </w:rPr>
@@ -239,7 +246,6 @@
           <w:spacing w:val="0"/>
           <w:sz w:val="12"/>
           <w:szCs w:val="12"/>
-          <w:bdr w:val="none" w:color="auto" w:sz="0" w:space="0"/>
           <w:shd w:val="clear" w:fill="FFFFFF"/>
           <w:vertAlign w:val="baseline"/>
         </w:rPr>
@@ -295,11 +301,102 @@
           <w:spacing w:val="0"/>
           <w:sz w:val="24"/>
           <w:szCs w:val="24"/>
-          <w:bdr w:val="none" w:color="auto" w:sz="0" w:space="0"/>
           <w:shd w:val="clear" w:fill="FFFFFF"/>
         </w:rPr>
         <w:t> </w:t>
       </w:r>
+    </w:p>
+    <w:p>
+      <w:pPr>
+        <w:rPr>
+          <w:rFonts w:hint="default" w:ascii="Times New Roman" w:hAnsi="Times New Roman" w:eastAsia="SimSun" w:cs="Times New Roman"/>
+          <w:i w:val="0"/>
+          <w:iCs w:val="0"/>
+          <w:caps w:val="0"/>
+          <w:color w:val="000000"/>
+          <w:spacing w:val="0"/>
+          <w:sz w:val="24"/>
+          <w:szCs w:val="24"/>
+          <w:shd w:val="clear" w:fill="FFFFFF"/>
+          <w:lang w:val="en-US"/>
+        </w:rPr>
+      </w:pPr>
+      <w:r>
+        <w:rPr>
+          <w:rFonts w:hint="default" w:ascii="Times New Roman" w:hAnsi="Times New Roman" w:eastAsia="SimSun" w:cs="Times New Roman"/>
+          <w:i w:val="0"/>
+          <w:iCs w:val="0"/>
+          <w:caps w:val="0"/>
+          <w:color w:val="000000"/>
+          <w:spacing w:val="0"/>
+          <w:sz w:val="24"/>
+          <w:szCs w:val="24"/>
+          <w:shd w:val="clear" w:fill="FFFFFF"/>
+          <w:lang w:val="en-US"/>
+        </w:rPr>
+        <w:t>Rag testing:</w:t>
+      </w:r>
+    </w:p>
+    <w:p>
+      <w:pPr>
+        <w:rPr>
+          <w:rFonts w:hint="default" w:ascii="Times New Roman" w:hAnsi="Times New Roman" w:eastAsia="SimSun" w:cs="Times New Roman"/>
+          <w:i w:val="0"/>
+          <w:iCs w:val="0"/>
+          <w:caps w:val="0"/>
+          <w:color w:val="000000"/>
+          <w:spacing w:val="0"/>
+          <w:sz w:val="24"/>
+          <w:szCs w:val="24"/>
+          <w:shd w:val="clear" w:fill="FFFFFF"/>
+          <w:lang w:val="en-US"/>
+        </w:rPr>
+      </w:pPr>
+      <w:r>
+        <w:drawing>
+          <wp:inline distT="0" distB="0" distL="114300" distR="114300">
+            <wp:extent cx="5267960" cy="2363470"/>
+            <wp:effectExtent l="0" t="0" r="2540" b="11430"/>
+            <wp:docPr id="6" name="Picture 1"/>
+            <wp:cNvGraphicFramePr>
+              <a:graphicFrameLocks xmlns:a="http://schemas.openxmlformats.org/drawingml/2006/main" noChangeAspect="1"/>
+            </wp:cNvGraphicFramePr>
+            <a:graphic xmlns:a="http://schemas.openxmlformats.org/drawingml/2006/main">
+              <a:graphicData uri="http://schemas.openxmlformats.org/drawingml/2006/picture">
+                <pic:pic xmlns:pic="http://schemas.openxmlformats.org/drawingml/2006/picture">
+                  <pic:nvPicPr>
+                    <pic:cNvPr id="6" name="Picture 1"/>
+                    <pic:cNvPicPr>
+                      <a:picLocks noChangeAspect="1"/>
+                    </pic:cNvPicPr>
+                  </pic:nvPicPr>
+                  <pic:blipFill>
+                    <a:blip r:embed="rId9"/>
+                    <a:stretch>
+                      <a:fillRect/>
+                    </a:stretch>
+                  </pic:blipFill>
+                  <pic:spPr>
+                    <a:xfrm>
+                      <a:off x="0" y="0"/>
+                      <a:ext cx="5267960" cy="2363470"/>
+                    </a:xfrm>
+                    <a:prstGeom prst="rect">
+                      <a:avLst/>
+                    </a:prstGeom>
+                    <a:noFill/>
+                    <a:ln>
+                      <a:noFill/>
+                    </a:ln>
+                  </pic:spPr>
+                </pic:pic>
+              </a:graphicData>
+            </a:graphic>
+          </wp:inline>
+        </w:drawing>
+      </w:r>
+      <w:bookmarkStart w:id="0" w:name="_GoBack"/>
+      <w:bookmarkEnd w:id="0"/>
     </w:p>
     <w:sectPr>
       <w:pgSz w:w="11906" w:h="16838"/>
@@ -425,7 +522,7 @@
     <w:lsdException w:unhideWhenUsed="0" w:uiPriority="0" w:semiHidden="0" w:name="HTML Sample"/>
     <w:lsdException w:unhideWhenUsed="0" w:uiPriority="0" w:semiHidden="0" w:name="HTML Typewriter"/>
     <w:lsdException w:unhideWhenUsed="0" w:uiPriority="0" w:semiHidden="0" w:name="HTML Variable"/>
-    <w:lsdException w:unhideWhenUsed="0" w:uiPriority="0" w:name="Normal Table"/>
+    <w:lsdException w:qFormat="1" w:unhideWhenUsed="0" w:uiPriority="0" w:name="Normal Table"/>
     <w:lsdException w:unhideWhenUsed="0" w:uiPriority="0" w:semiHidden="0" w:name="annotation subject"/>
     <w:lsdException w:unhideWhenUsed="0" w:uiPriority="0" w:semiHidden="0" w:name="Table Simple 1"/>
     <w:lsdException w:unhideWhenUsed="0" w:uiPriority="0" w:semiHidden="0" w:name="Table Simple 2"/>
@@ -589,6 +686,7 @@
   <w:style w:type="table" w:default="1" w:styleId="3">
     <w:name w:val="Normal Table"/>
     <w:semiHidden/>
+    <w:qFormat/>
     <w:uiPriority w:val="0"/>
     <w:tblPr>
       <w:tblCellMar>

</xml_diff>